<commit_message>
Add Random Forest vs Gradient Boosting tradeoff analysis
Notebook: new Cell 18c/18d compute per-shipment APE for RF and GBM on
the Model B holdout and chart the tradeoff (error distribution +
median/mean/max APE comparison), saved as figures/fig9. Metrics
persisted to metrics.json under rf_vs_gbm_tradeoff.

Report: new supplementary section after Technique 2 (Ridge Regression)
presenting Table D5 (RF vs GBM holdout metrics) and Figure 9, with the
tradeoff stated explicitly: GBM handles extremes better (lower mean
and worst-case error, higher overall R2), RF is more consistent on a
typical/median shipment. Formatting verified against the original
committed docx: all 568 original paragraphs and 7 tables intact and
in order, new captions match the existing Table D2-D4 style.
</commit_message>
<xml_diff>
--- a/report/Freight_Cost_Prediction_Findings.docx
+++ b/report/Freight_Cost_Prediction_Findings.docx
@@ -12739,6 +12739,485 @@
       </w:r>
       <w:r>
         <w:t>.</w:t>
+      </w:r>
+    </w:p>
+    <w:p>
+      <w:pPr>
+        <w:pStyle w:val="Heading2"/>
+      </w:pPr>
+      <w:r>
+        <w:t>Supplementary Analysis: Random Forest and the Consistency/Extremes Tradeoff</w:t>
+      </w:r>
+    </w:p>
+    <w:p>
+      <w:r>
+        <w:t>Beyond the two techniques above, the broader model sweep behind this notebook also fit a Random Forest (scikit-learn's RandomForestRegressor, 300 trees) on the same enriched feature set as gradient boosting (Model B: the two order-time predictors plus great-circle distance, mode-matched fuel price, and their missingness flags). This comparison is supplementary: it sits outside the primary gradient boosting versus ridge regression comparison above, but it surfaces a tradeoff worth acting on.</w:t>
+      </w:r>
+    </w:p>
+    <w:p/>
+    <w:tbl>
+      <w:tblPr>
+        <w:tblStyle w:val="TableGrid"/>
+        <w:tblW w:w="0" w:type="auto"/>
+        <w:tblLook w:val="04A0" w:firstRow="1" w:lastRow="0" w:firstColumn="1" w:lastColumn="0" w:noHBand="0" w:noVBand="1"/>
+      </w:tblPr>
+      <w:tblGrid>
+        <w:gridCol w:w="1559"/>
+        <w:gridCol w:w="1559"/>
+        <w:gridCol w:w="1558"/>
+        <w:gridCol w:w="1558"/>
+        <w:gridCol w:w="1558"/>
+        <w:gridCol w:w="1558"/>
+      </w:tblGrid>
+      <w:tr>
+        <w:trPr>
+          <w:cantSplit/>
+        </w:trPr>
+        <w:tc>
+          <w:tcPr>
+            <w:tcW w:w="1560" w:type="dxa"/>
+            <w:shd w:val="clear" w:color="auto" w:fill="124A38"/>
+          </w:tcPr>
+          <w:p>
+            <w:pPr>
+              <w:keepNext/>
+              <w:keepLines/>
+              <w:spacing w:before="20" w:after="20"/>
+            </w:pPr>
+            <w:r>
+              <w:rPr>
+                <w:b/>
+                <w:color w:val="FFFFFF"/>
+                <w:sz w:val="19"/>
+              </w:rPr>
+              <w:t>Model</w:t>
+            </w:r>
+          </w:p>
+        </w:tc>
+        <w:tc>
+          <w:tcPr>
+            <w:tcW w:w="1560" w:type="dxa"/>
+            <w:shd w:val="clear" w:color="auto" w:fill="124A38"/>
+          </w:tcPr>
+          <w:p>
+            <w:pPr>
+              <w:keepNext/>
+              <w:keepLines/>
+              <w:spacing w:before="20" w:after="20"/>
+            </w:pPr>
+            <w:r>
+              <w:rPr>
+                <w:b/>
+                <w:color w:val="FFFFFF"/>
+                <w:sz w:val="19"/>
+              </w:rPr>
+              <w:t>R² (log)</w:t>
+            </w:r>
+          </w:p>
+        </w:tc>
+        <w:tc>
+          <w:tcPr>
+            <w:tcW w:w="1560" w:type="dxa"/>
+            <w:shd w:val="clear" w:color="auto" w:fill="124A38"/>
+          </w:tcPr>
+          <w:p>
+            <w:pPr>
+              <w:keepNext/>
+              <w:keepLines/>
+              <w:spacing w:before="20" w:after="20"/>
+            </w:pPr>
+            <w:r>
+              <w:rPr>
+                <w:b/>
+                <w:color w:val="FFFFFF"/>
+                <w:sz w:val="19"/>
+              </w:rPr>
+              <w:t>Adjusted R²</w:t>
+            </w:r>
+          </w:p>
+        </w:tc>
+        <w:tc>
+          <w:tcPr>
+            <w:tcW w:w="1560" w:type="dxa"/>
+            <w:shd w:val="clear" w:color="auto" w:fill="124A38"/>
+          </w:tcPr>
+          <w:p>
+            <w:pPr>
+              <w:keepNext/>
+              <w:keepLines/>
+              <w:spacing w:before="20" w:after="20"/>
+            </w:pPr>
+            <w:r>
+              <w:rPr>
+                <w:b/>
+                <w:color w:val="FFFFFF"/>
+                <w:sz w:val="19"/>
+              </w:rPr>
+              <w:t>RMSE</w:t>
+            </w:r>
+          </w:p>
+        </w:tc>
+        <w:tc>
+          <w:tcPr>
+            <w:tcW w:w="1560" w:type="dxa"/>
+            <w:shd w:val="clear" w:color="auto" w:fill="124A38"/>
+          </w:tcPr>
+          <w:p>
+            <w:pPr>
+              <w:keepNext/>
+              <w:keepLines/>
+              <w:spacing w:before="20" w:after="20"/>
+            </w:pPr>
+            <w:r>
+              <w:rPr>
+                <w:b/>
+                <w:color w:val="FFFFFF"/>
+                <w:sz w:val="19"/>
+              </w:rPr>
+              <w:t>Median APE</w:t>
+            </w:r>
+          </w:p>
+        </w:tc>
+        <w:tc>
+          <w:tcPr>
+            <w:tcW w:w="1560" w:type="dxa"/>
+            <w:shd w:val="clear" w:color="auto" w:fill="124A38"/>
+          </w:tcPr>
+          <w:p>
+            <w:pPr>
+              <w:keepNext/>
+              <w:keepLines/>
+              <w:spacing w:before="20" w:after="20"/>
+            </w:pPr>
+            <w:r>
+              <w:rPr>
+                <w:b/>
+                <w:color w:val="FFFFFF"/>
+                <w:sz w:val="19"/>
+              </w:rPr>
+              <w:t>Mean APE</w:t>
+            </w:r>
+          </w:p>
+        </w:tc>
+      </w:tr>
+      <w:tr>
+        <w:trPr>
+          <w:cantSplit/>
+        </w:trPr>
+        <w:tc>
+          <w:tcPr>
+            <w:tcW w:w="1560" w:type="dxa"/>
+          </w:tcPr>
+          <w:p>
+            <w:pPr>
+              <w:keepNext/>
+              <w:keepLines/>
+              <w:spacing w:before="20" w:after="20"/>
+            </w:pPr>
+            <w:r>
+              <w:rPr>
+                <w:sz w:val="19"/>
+              </w:rPr>
+              <w:t>Random Forest</w:t>
+            </w:r>
+          </w:p>
+        </w:tc>
+        <w:tc>
+          <w:tcPr>
+            <w:tcW w:w="1560" w:type="dxa"/>
+          </w:tcPr>
+          <w:p>
+            <w:pPr>
+              <w:keepNext/>
+              <w:keepLines/>
+              <w:spacing w:before="20" w:after="20"/>
+            </w:pPr>
+            <w:r>
+              <w:rPr>
+                <w:sz w:val="19"/>
+              </w:rPr>
+              <w:t>0.722</w:t>
+            </w:r>
+          </w:p>
+        </w:tc>
+        <w:tc>
+          <w:tcPr>
+            <w:tcW w:w="1560" w:type="dxa"/>
+          </w:tcPr>
+          <w:p>
+            <w:pPr>
+              <w:keepNext/>
+              <w:keepLines/>
+              <w:spacing w:before="20" w:after="20"/>
+            </w:pPr>
+            <w:r>
+              <w:rPr>
+                <w:sz w:val="19"/>
+              </w:rPr>
+              <w:t>0.719</w:t>
+            </w:r>
+          </w:p>
+        </w:tc>
+        <w:tc>
+          <w:tcPr>
+            <w:tcW w:w="1560" w:type="dxa"/>
+          </w:tcPr>
+          <w:p>
+            <w:pPr>
+              <w:keepNext/>
+              <w:keepLines/>
+              <w:spacing w:before="20" w:after="20"/>
+            </w:pPr>
+            <w:r>
+              <w:rPr>
+                <w:sz w:val="19"/>
+              </w:rPr>
+              <w:t>$9,644</w:t>
+            </w:r>
+          </w:p>
+        </w:tc>
+        <w:tc>
+          <w:tcPr>
+            <w:tcW w:w="1560" w:type="dxa"/>
+          </w:tcPr>
+          <w:p>
+            <w:pPr>
+              <w:keepNext/>
+              <w:keepLines/>
+              <w:spacing w:before="20" w:after="20"/>
+            </w:pPr>
+            <w:r>
+              <w:rPr>
+                <w:sz w:val="19"/>
+              </w:rPr>
+              <w:t>29%</w:t>
+            </w:r>
+          </w:p>
+        </w:tc>
+        <w:tc>
+          <w:tcPr>
+            <w:tcW w:w="1560" w:type="dxa"/>
+          </w:tcPr>
+          <w:p>
+            <w:pPr>
+              <w:keepNext/>
+              <w:keepLines/>
+              <w:spacing w:before="20" w:after="20"/>
+            </w:pPr>
+            <w:r>
+              <w:rPr>
+                <w:sz w:val="19"/>
+              </w:rPr>
+              <w:t>95%</w:t>
+            </w:r>
+          </w:p>
+        </w:tc>
+      </w:tr>
+      <w:tr>
+        <w:trPr>
+          <w:cantSplit/>
+        </w:trPr>
+        <w:tc>
+          <w:tcPr>
+            <w:tcW w:w="1560" w:type="dxa"/>
+          </w:tcPr>
+          <w:p>
+            <w:pPr>
+              <w:keepNext/>
+              <w:keepLines/>
+              <w:spacing w:before="20" w:after="20"/>
+            </w:pPr>
+            <w:r>
+              <w:rPr>
+                <w:sz w:val="19"/>
+              </w:rPr>
+              <w:t>Gradient Boosting</w:t>
+            </w:r>
+          </w:p>
+        </w:tc>
+        <w:tc>
+          <w:tcPr>
+            <w:tcW w:w="1560" w:type="dxa"/>
+          </w:tcPr>
+          <w:p>
+            <w:pPr>
+              <w:keepNext/>
+              <w:keepLines/>
+              <w:spacing w:before="20" w:after="20"/>
+            </w:pPr>
+            <w:r>
+              <w:rPr>
+                <w:sz w:val="19"/>
+              </w:rPr>
+              <w:t>0.753</w:t>
+            </w:r>
+          </w:p>
+        </w:tc>
+        <w:tc>
+          <w:tcPr>
+            <w:tcW w:w="1560" w:type="dxa"/>
+          </w:tcPr>
+          <w:p>
+            <w:pPr>
+              <w:keepNext/>
+              <w:keepLines/>
+              <w:spacing w:before="20" w:after="20"/>
+            </w:pPr>
+            <w:r>
+              <w:rPr>
+                <w:sz w:val="19"/>
+              </w:rPr>
+              <w:t>0.750</w:t>
+            </w:r>
+          </w:p>
+        </w:tc>
+        <w:tc>
+          <w:tcPr>
+            <w:tcW w:w="1560" w:type="dxa"/>
+          </w:tcPr>
+          <w:p>
+            <w:pPr>
+              <w:keepNext/>
+              <w:keepLines/>
+              <w:spacing w:before="20" w:after="20"/>
+            </w:pPr>
+            <w:r>
+              <w:rPr>
+                <w:sz w:val="19"/>
+              </w:rPr>
+              <w:t>$10,329</w:t>
+            </w:r>
+          </w:p>
+        </w:tc>
+        <w:tc>
+          <w:tcPr>
+            <w:tcW w:w="1560" w:type="dxa"/>
+          </w:tcPr>
+          <w:p>
+            <w:pPr>
+              <w:keepNext/>
+              <w:keepLines/>
+              <w:spacing w:before="20" w:after="20"/>
+            </w:pPr>
+            <w:r>
+              <w:rPr>
+                <w:sz w:val="19"/>
+              </w:rPr>
+              <w:t>32%</w:t>
+            </w:r>
+          </w:p>
+        </w:tc>
+        <w:tc>
+          <w:tcPr>
+            <w:tcW w:w="1560" w:type="dxa"/>
+          </w:tcPr>
+          <w:p>
+            <w:pPr>
+              <w:keepNext/>
+              <w:keepLines/>
+              <w:spacing w:before="20" w:after="20"/>
+            </w:pPr>
+            <w:r>
+              <w:rPr>
+                <w:sz w:val="19"/>
+              </w:rPr>
+              <w:t>74%</w:t>
+            </w:r>
+          </w:p>
+        </w:tc>
+      </w:tr>
+    </w:tbl>
+    <w:p/>
+    <w:p>
+      <w:pPr>
+        <w:keepNext/>
+        <w:keepLines/>
+        <w:ind w:left="144"/>
+      </w:pPr>
+      <w:r>
+        <w:rPr>
+          <w:rFonts w:ascii="Calibri" w:hAnsi="Calibri"/>
+          <w:b/>
+          <w:color w:val="124A38"/>
+          <w:sz w:val="18"/>
+        </w:rPr>
+        <w:t>Table D5.</w:t>
+      </w:r>
+      <w:r>
+        <w:rPr>
+          <w:i/>
+          <w:color w:val="808080"/>
+          <w:sz w:val="18"/>
+        </w:rPr>
+        <w:t xml:space="preserve"> Random Forest vs. Gradient Boosting, enriched feature set, holdout metrics (n = 1,240).</w:t>
+      </w:r>
+    </w:p>
+    <w:p/>
+    <w:p>
+      <w:r>
+        <w:t>Random Forest and Gradient Boosting fail differently, and the difference is decision-relevant. Random Forest's median absolute percentage error, the typical shipment, is 29% against gradient boosting's 32%: Random Forest is the more consistent model for the shipment you would actually expect to see day to day. Gradient boosting pulls ahead once extremes enter the picture: its mean absolute percentage error (74% versus 95%) and worst-case error (17,817% versus 34,470%) are both markedly lower, which is also why its overall R² (0.753 versus 0.722) comes out ahead. Extremes are worth calculating for: a handful of very large freight costs can move a budget more than a long run of typical ones, so gradient boosting is the safer choice wherever that tail risk matters. But if the priority is consistency on a typical shipment, the case a day-to-day cost review or a renegotiation worklist most often touches, the tradeoff favors Random Forest.</w:t>
+      </w:r>
+    </w:p>
+    <w:p/>
+    <w:p>
+      <w:r>
+        <w:drawing>
+          <wp:inline xmlns:a="http://schemas.openxmlformats.org/drawingml/2006/main" xmlns:pic="http://schemas.openxmlformats.org/drawingml/2006/picture">
+            <wp:extent cx="5760720" cy="2356658"/>
+            <wp:docPr id="2005616819" name="Picture 2005616819"/>
+            <wp:cNvGraphicFramePr>
+              <a:graphicFrameLocks noChangeAspect="1"/>
+            </wp:cNvGraphicFramePr>
+            <a:graphic>
+              <a:graphicData uri="http://schemas.openxmlformats.org/drawingml/2006/picture">
+                <pic:pic>
+                  <pic:nvPicPr>
+                    <pic:cNvPr id="0" name="fig9_rf_vs_gbm_tradeoff.png"/>
+                    <pic:cNvPicPr/>
+                  </pic:nvPicPr>
+                  <pic:blipFill>
+                    <a:blip r:embed="rId43"/>
+                    <a:stretch>
+                      <a:fillRect/>
+                    </a:stretch>
+                  </pic:blipFill>
+                  <pic:spPr>
+                    <a:xfrm>
+                      <a:off x="0" y="0"/>
+                      <a:ext cx="5760720" cy="2356658"/>
+                    </a:xfrm>
+                    <a:prstGeom prst="rect"/>
+                  </pic:spPr>
+                </pic:pic>
+              </a:graphicData>
+            </a:graphic>
+          </wp:inline>
+        </w:drawing>
+      </w:r>
+    </w:p>
+    <w:p/>
+    <w:p>
+      <w:pPr>
+        <w:keepNext/>
+        <w:keepLines/>
+        <w:ind w:left="144"/>
+      </w:pPr>
+      <w:r>
+        <w:rPr>
+          <w:rFonts w:ascii="Calibri" w:hAnsi="Calibri"/>
+          <w:b/>
+          <w:color w:val="124A38"/>
+          <w:sz w:val="18"/>
+        </w:rPr>
+        <w:t>Figure 9.</w:t>
+      </w:r>
+      <w:r>
+        <w:rPr>
+          <w:i/>
+          <w:color w:val="808080"/>
+          <w:sz w:val="18"/>
+        </w:rPr>
+        <w:t xml:space="preserve"> Random Forest vs. Gradient Boosting: error distribution and the consistency/extremes tradeoff (holdout n = 1,240).</w:t>
       </w:r>
     </w:p>
     <w:p>

</xml_diff>